<commit_message>
Update project report title page for solo student THAMIZHARASAN M
</commit_message>
<xml_diff>
--- a/EcoPilot_Final_Project_Report.docx
+++ b/EcoPilot_Final_Project_Report.docx
@@ -116,22 +116,6 @@
     </w:p>
     <w:p>
       <w:pPr>
-        <w:spacing w:before="240" w:after="120" w:line="276" w:lineRule="auto"/>
-        <w:jc w:val="center"/>
-      </w:pPr>
-      <w:r>
-        <w:rPr>
-          <w:rFonts w:ascii="Times New Roman" w:hAnsi="Times New Roman"/>
-          <w:b/>
-          <w:i w:val="0"/>
-          <w:color w:val="000000"/>
-          <w:sz w:val="28"/>
-        </w:rPr>
-        <w:t>Team Name: FUTURE CODERS</w:t>
-      </w:r>
-    </w:p>
-    <w:p>
-      <w:pPr>
         <w:spacing w:before="0" w:after="480" w:line="276" w:lineRule="auto"/>
         <w:jc w:val="center"/>
       </w:pPr>
@@ -173,71 +157,7 @@
           <w:b/>
           <w:i w:val="0"/>
           <w:color w:val="000000"/>
-          <w:sz w:val="23"/>
-        </w:rPr>
-        <w:t>THANIKAIVEL S</w:t>
-      </w:r>
-    </w:p>
-    <w:p>
-      <w:pPr>
-        <w:spacing w:before="0" w:after="40" w:line="276" w:lineRule="auto"/>
-        <w:jc w:val="center"/>
-      </w:pPr>
-      <w:r>
-        <w:rPr>
-          <w:rFonts w:ascii="Times New Roman" w:hAnsi="Times New Roman"/>
-          <w:b/>
-          <w:i w:val="0"/>
-          <w:color w:val="000000"/>
-          <w:sz w:val="23"/>
-        </w:rPr>
-        <w:t>THANESHWAR M</w:t>
-      </w:r>
-    </w:p>
-    <w:p>
-      <w:pPr>
-        <w:spacing w:before="0" w:after="40" w:line="276" w:lineRule="auto"/>
-        <w:jc w:val="center"/>
-      </w:pPr>
-      <w:r>
-        <w:rPr>
-          <w:rFonts w:ascii="Times New Roman" w:hAnsi="Times New Roman"/>
-          <w:b/>
-          <w:i w:val="0"/>
-          <w:color w:val="000000"/>
-          <w:sz w:val="23"/>
-        </w:rPr>
-        <w:t>THAMBURAJ B</w:t>
-      </w:r>
-    </w:p>
-    <w:p>
-      <w:pPr>
-        <w:spacing w:before="0" w:after="40" w:line="276" w:lineRule="auto"/>
-        <w:jc w:val="center"/>
-      </w:pPr>
-      <w:r>
-        <w:rPr>
-          <w:rFonts w:ascii="Times New Roman" w:hAnsi="Times New Roman"/>
-          <w:b/>
-          <w:i w:val="0"/>
-          <w:color w:val="000000"/>
-          <w:sz w:val="23"/>
-        </w:rPr>
-        <w:t>TARUN ANTONY M</w:t>
-      </w:r>
-    </w:p>
-    <w:p>
-      <w:pPr>
-        <w:spacing w:before="0" w:after="40" w:line="276" w:lineRule="auto"/>
-        <w:jc w:val="center"/>
-      </w:pPr>
-      <w:r>
-        <w:rPr>
-          <w:rFonts w:ascii="Times New Roman" w:hAnsi="Times New Roman"/>
-          <w:b/>
-          <w:i w:val="0"/>
-          <w:color w:val="000000"/>
-          <w:sz w:val="23"/>
+          <w:sz w:val="24"/>
         </w:rPr>
         <w:t>THAMIZHARASAN M</w:t>
       </w:r>

</xml_diff>

<commit_message>
Document Render.com and Vercel cloud deployment architecture in Word and Markdown reports
</commit_message>
<xml_diff>
--- a/EcoPilot_Final_Project_Report.docx
+++ b/EcoPilot_Final_Project_Report.docx
@@ -4136,7 +4136,7 @@
                 <w:color w:val="000000"/>
                 <w:sz w:val="19"/>
               </w:rPr>
-              <w:t>Frontend</w:t>
+              <w:t>Frontend Framework</w:t>
             </w:r>
           </w:p>
         </w:tc>
@@ -4207,7 +4207,220 @@
                 <w:color w:val="000000"/>
                 <w:sz w:val="19"/>
               </w:rPr>
-              <w:t>Styling</w:t>
+              <w:t>Frontend Hosting</w:t>
+            </w:r>
+          </w:p>
+        </w:tc>
+        <w:tc>
+          <w:tcPr>
+            <w:tcW w:type="dxa" w:w="3120"/>
+            <w:tcMar>
+              <w:top w:w="80" w:type="dxa"/>
+              <w:bottom w:w="80" w:type="dxa"/>
+              <w:left w:w="120" w:type="dxa"/>
+              <w:right w:w="120" w:type="dxa"/>
+            </w:tcMar>
+          </w:tcPr>
+          <w:p>
+            <w:r>
+              <w:rPr>
+                <w:rFonts w:ascii="Times New Roman" w:hAnsi="Times New Roman"/>
+                <w:b w:val="0"/>
+                <w:i w:val="0"/>
+                <w:color w:val="000000"/>
+                <w:sz w:val="19"/>
+              </w:rPr>
+              <w:t>Vercel Cloud Platform</w:t>
+            </w:r>
+          </w:p>
+        </w:tc>
+        <w:tc>
+          <w:tcPr>
+            <w:tcW w:type="dxa" w:w="3120"/>
+            <w:tcMar>
+              <w:top w:w="80" w:type="dxa"/>
+              <w:bottom w:w="80" w:type="dxa"/>
+              <w:left w:w="120" w:type="dxa"/>
+              <w:right w:w="120" w:type="dxa"/>
+            </w:tcMar>
+          </w:tcPr>
+          <w:p>
+            <w:r>
+              <w:rPr>
+                <w:rFonts w:ascii="Times New Roman" w:hAnsi="Times New Roman"/>
+                <w:b w:val="0"/>
+                <w:i w:val="0"/>
+                <w:color w:val="000000"/>
+                <w:sz w:val="19"/>
+              </w:rPr>
+              <w:t>Production single-page app deployment &amp; CDN</w:t>
+            </w:r>
+          </w:p>
+        </w:tc>
+      </w:tr>
+      <w:tr>
+        <w:tc>
+          <w:tcPr>
+            <w:tcW w:type="dxa" w:w="3120"/>
+            <w:tcMar>
+              <w:top w:w="80" w:type="dxa"/>
+              <w:bottom w:w="80" w:type="dxa"/>
+              <w:left w:w="120" w:type="dxa"/>
+              <w:right w:w="120" w:type="dxa"/>
+            </w:tcMar>
+          </w:tcPr>
+          <w:p>
+            <w:r>
+              <w:rPr>
+                <w:rFonts w:ascii="Times New Roman" w:hAnsi="Times New Roman"/>
+                <w:b w:val="0"/>
+                <w:i w:val="0"/>
+                <w:color w:val="000000"/>
+                <w:sz w:val="19"/>
+              </w:rPr>
+              <w:t>Backend Framework</w:t>
+            </w:r>
+          </w:p>
+        </w:tc>
+        <w:tc>
+          <w:tcPr>
+            <w:tcW w:type="dxa" w:w="3120"/>
+            <w:tcMar>
+              <w:top w:w="80" w:type="dxa"/>
+              <w:bottom w:w="80" w:type="dxa"/>
+              <w:left w:w="120" w:type="dxa"/>
+              <w:right w:w="120" w:type="dxa"/>
+            </w:tcMar>
+          </w:tcPr>
+          <w:p>
+            <w:r>
+              <w:rPr>
+                <w:rFonts w:ascii="Times New Roman" w:hAnsi="Times New Roman"/>
+                <w:b w:val="0"/>
+                <w:i w:val="0"/>
+                <w:color w:val="000000"/>
+                <w:sz w:val="19"/>
+              </w:rPr>
+              <w:t>Python 3.10+ / FastAPI</w:t>
+            </w:r>
+          </w:p>
+        </w:tc>
+        <w:tc>
+          <w:tcPr>
+            <w:tcW w:type="dxa" w:w="3120"/>
+            <w:tcMar>
+              <w:top w:w="80" w:type="dxa"/>
+              <w:bottom w:w="80" w:type="dxa"/>
+              <w:left w:w="120" w:type="dxa"/>
+              <w:right w:w="120" w:type="dxa"/>
+            </w:tcMar>
+          </w:tcPr>
+          <w:p>
+            <w:r>
+              <w:rPr>
+                <w:rFonts w:ascii="Times New Roman" w:hAnsi="Times New Roman"/>
+                <w:b w:val="0"/>
+                <w:i w:val="0"/>
+                <w:color w:val="000000"/>
+                <w:sz w:val="19"/>
+              </w:rPr>
+              <w:t>Asynchronous REST API server &amp; routing</w:t>
+            </w:r>
+          </w:p>
+        </w:tc>
+      </w:tr>
+      <w:tr>
+        <w:tc>
+          <w:tcPr>
+            <w:tcW w:type="dxa" w:w="3120"/>
+            <w:tcMar>
+              <w:top w:w="80" w:type="dxa"/>
+              <w:bottom w:w="80" w:type="dxa"/>
+              <w:left w:w="120" w:type="dxa"/>
+              <w:right w:w="120" w:type="dxa"/>
+            </w:tcMar>
+          </w:tcPr>
+          <w:p>
+            <w:r>
+              <w:rPr>
+                <w:rFonts w:ascii="Times New Roman" w:hAnsi="Times New Roman"/>
+                <w:b w:val="0"/>
+                <w:i w:val="0"/>
+                <w:color w:val="000000"/>
+                <w:sz w:val="19"/>
+              </w:rPr>
+              <w:t>Backend Hosting</w:t>
+            </w:r>
+          </w:p>
+        </w:tc>
+        <w:tc>
+          <w:tcPr>
+            <w:tcW w:type="dxa" w:w="3120"/>
+            <w:tcMar>
+              <w:top w:w="80" w:type="dxa"/>
+              <w:bottom w:w="80" w:type="dxa"/>
+              <w:left w:w="120" w:type="dxa"/>
+              <w:right w:w="120" w:type="dxa"/>
+            </w:tcMar>
+          </w:tcPr>
+          <w:p>
+            <w:r>
+              <w:rPr>
+                <w:rFonts w:ascii="Times New Roman" w:hAnsi="Times New Roman"/>
+                <w:b w:val="0"/>
+                <w:i w:val="0"/>
+                <w:color w:val="000000"/>
+                <w:sz w:val="19"/>
+              </w:rPr>
+              <w:t>Render.com Cloud Platform</w:t>
+            </w:r>
+          </w:p>
+        </w:tc>
+        <w:tc>
+          <w:tcPr>
+            <w:tcW w:type="dxa" w:w="3120"/>
+            <w:tcMar>
+              <w:top w:w="80" w:type="dxa"/>
+              <w:bottom w:w="80" w:type="dxa"/>
+              <w:left w:w="120" w:type="dxa"/>
+              <w:right w:w="120" w:type="dxa"/>
+            </w:tcMar>
+          </w:tcPr>
+          <w:p>
+            <w:r>
+              <w:rPr>
+                <w:rFonts w:ascii="Times New Roman" w:hAnsi="Times New Roman"/>
+                <w:b w:val="0"/>
+                <w:i w:val="0"/>
+                <w:color w:val="000000"/>
+                <w:sz w:val="19"/>
+              </w:rPr>
+              <w:t>Production Uvicorn server hosting &amp; environment secret management</w:t>
+            </w:r>
+          </w:p>
+        </w:tc>
+      </w:tr>
+      <w:tr>
+        <w:tc>
+          <w:tcPr>
+            <w:tcW w:type="dxa" w:w="3120"/>
+            <w:tcMar>
+              <w:top w:w="80" w:type="dxa"/>
+              <w:bottom w:w="80" w:type="dxa"/>
+              <w:left w:w="120" w:type="dxa"/>
+              <w:right w:w="120" w:type="dxa"/>
+            </w:tcMar>
+          </w:tcPr>
+          <w:p>
+            <w:r>
+              <w:rPr>
+                <w:rFonts w:ascii="Times New Roman" w:hAnsi="Times New Roman"/>
+                <w:b w:val="0"/>
+                <w:i w:val="0"/>
+                <w:color w:val="000000"/>
+                <w:sz w:val="19"/>
+              </w:rPr>
+              <w:t>Styling System</w:t>
             </w:r>
           </w:p>
         </w:tc>
@@ -4278,7 +4491,7 @@
                 <w:color w:val="000000"/>
                 <w:sz w:val="19"/>
               </w:rPr>
-              <w:t>Charts</w:t>
+              <w:t>Data Visualization</w:t>
             </w:r>
           </w:p>
         </w:tc>
@@ -4349,7 +4562,7 @@
                 <w:color w:val="000000"/>
                 <w:sz w:val="19"/>
               </w:rPr>
-              <w:t>PDF Export</w:t>
+              <w:t>PDF Report Exporter</w:t>
             </w:r>
           </w:p>
         </w:tc>
@@ -4395,7 +4608,7 @@
                 <w:color w:val="000000"/>
                 <w:sz w:val="19"/>
               </w:rPr>
-              <w:t>Client-side PDF generation engine</w:t>
+              <w:t>Client-side PDF report compilation engine</w:t>
             </w:r>
           </w:p>
         </w:tc>
@@ -4420,78 +4633,7 @@
                 <w:color w:val="000000"/>
                 <w:sz w:val="19"/>
               </w:rPr>
-              <w:t>Backend Framework</w:t>
-            </w:r>
-          </w:p>
-        </w:tc>
-        <w:tc>
-          <w:tcPr>
-            <w:tcW w:type="dxa" w:w="3120"/>
-            <w:tcMar>
-              <w:top w:w="80" w:type="dxa"/>
-              <w:bottom w:w="80" w:type="dxa"/>
-              <w:left w:w="120" w:type="dxa"/>
-              <w:right w:w="120" w:type="dxa"/>
-            </w:tcMar>
-          </w:tcPr>
-          <w:p>
-            <w:r>
-              <w:rPr>
-                <w:rFonts w:ascii="Times New Roman" w:hAnsi="Times New Roman"/>
-                <w:b w:val="0"/>
-                <w:i w:val="0"/>
-                <w:color w:val="000000"/>
-                <w:sz w:val="19"/>
-              </w:rPr>
-              <w:t>Python 3.10+ / FastAPI</w:t>
-            </w:r>
-          </w:p>
-        </w:tc>
-        <w:tc>
-          <w:tcPr>
-            <w:tcW w:type="dxa" w:w="3120"/>
-            <w:tcMar>
-              <w:top w:w="80" w:type="dxa"/>
-              <w:bottom w:w="80" w:type="dxa"/>
-              <w:left w:w="120" w:type="dxa"/>
-              <w:right w:w="120" w:type="dxa"/>
-            </w:tcMar>
-          </w:tcPr>
-          <w:p>
-            <w:r>
-              <w:rPr>
-                <w:rFonts w:ascii="Times New Roman" w:hAnsi="Times New Roman"/>
-                <w:b w:val="0"/>
-                <w:i w:val="0"/>
-                <w:color w:val="000000"/>
-                <w:sz w:val="19"/>
-              </w:rPr>
-              <w:t>Asynchronous REST backend server</w:t>
-            </w:r>
-          </w:p>
-        </w:tc>
-      </w:tr>
-      <w:tr>
-        <w:tc>
-          <w:tcPr>
-            <w:tcW w:type="dxa" w:w="3120"/>
-            <w:tcMar>
-              <w:top w:w="80" w:type="dxa"/>
-              <w:bottom w:w="80" w:type="dxa"/>
-              <w:left w:w="120" w:type="dxa"/>
-              <w:right w:w="120" w:type="dxa"/>
-            </w:tcMar>
-          </w:tcPr>
-          <w:p>
-            <w:r>
-              <w:rPr>
-                <w:rFonts w:ascii="Times New Roman" w:hAnsi="Times New Roman"/>
-                <w:b w:val="0"/>
-                <w:i w:val="0"/>
-                <w:color w:val="000000"/>
-                <w:sz w:val="19"/>
-              </w:rPr>
-              <w:t>Vector Search</w:t>
+              <w:t>Vector Index Search</w:t>
             </w:r>
           </w:p>
         </w:tc>
@@ -4537,7 +4679,7 @@
                 <w:color w:val="000000"/>
                 <w:sz w:val="19"/>
               </w:rPr>
-              <w:t>Dense vector similarity index</w:t>
+              <w:t>Dense vector similarity search index</w:t>
             </w:r>
           </w:p>
         </w:tc>
@@ -4562,7 +4704,7 @@
                 <w:color w:val="000000"/>
                 <w:sz w:val="19"/>
               </w:rPr>
-              <w:t>Embeddings</w:t>
+              <w:t>Text Embeddings</w:t>
             </w:r>
           </w:p>
         </w:tc>
@@ -4608,7 +4750,7 @@
                 <w:color w:val="000000"/>
                 <w:sz w:val="19"/>
               </w:rPr>
-              <w:t>`all-MiniLM-L6-v2` dense embeddings</w:t>
+              <w:t>`all-MiniLM-L6-v2` dense embedding model</w:t>
             </w:r>
           </w:p>
         </w:tc>
@@ -4633,7 +4775,7 @@
                 <w:color w:val="000000"/>
                 <w:sz w:val="19"/>
               </w:rPr>
-              <w:t>Cloud Storage</w:t>
+              <w:t>Cloud Database</w:t>
             </w:r>
           </w:p>
         </w:tc>
@@ -4679,7 +4821,7 @@
                 <w:color w:val="000000"/>
                 <w:sz w:val="19"/>
               </w:rPr>
-              <w:t>NoSQL document database</w:t>
+              <w:t>NoSQL document persistence database</w:t>
             </w:r>
           </w:p>
         </w:tc>
@@ -4750,7 +4892,7 @@
                 <w:color w:val="000000"/>
                 <w:sz w:val="19"/>
               </w:rPr>
-              <w:t>Secure user identity service</w:t>
+              <w:t>Secure identity &amp; token management service</w:t>
             </w:r>
           </w:p>
         </w:tc>
@@ -4775,7 +4917,7 @@
                 <w:color w:val="000000"/>
                 <w:sz w:val="19"/>
               </w:rPr>
-              <w:t>AI API</w:t>
+              <w:t>AI API Provider</w:t>
             </w:r>
           </w:p>
         </w:tc>
@@ -4821,7 +4963,7 @@
                 <w:color w:val="000000"/>
                 <w:sz w:val="19"/>
               </w:rPr>
-              <w:t>Ultra-low-latency hosted inference</w:t>
+              <w:t>Ultra-low-latency hosted LPU inference engine</w:t>
             </w:r>
           </w:p>
         </w:tc>
@@ -4846,7 +4988,7 @@
                 <w:color w:val="000000"/>
                 <w:sz w:val="19"/>
               </w:rPr>
-              <w:t>LLM Model</w:t>
+              <w:t>Production LLM Model</w:t>
             </w:r>
           </w:p>
         </w:tc>
@@ -4892,7 +5034,7 @@
                 <w:color w:val="000000"/>
                 <w:sz w:val="19"/>
               </w:rPr>
-              <w:t>Production 27B open weights LLM</w:t>
+              <w:t>27B parameter open-weights LLM model</w:t>
             </w:r>
           </w:p>
         </w:tc>
@@ -4963,7 +5105,7 @@
                 <w:color w:val="000000"/>
                 <w:sz w:val="19"/>
               </w:rPr>
-              <w:t>Repository hosting &amp; auto-sync hook</w:t>
+              <w:t>Source code management &amp; automated deployment hook</w:t>
             </w:r>
           </w:p>
         </w:tc>
@@ -5184,7 +5326,7 @@
           <w:color w:val="000000"/>
           <w:sz w:val="22"/>
         </w:rPr>
-        <w:t xml:space="preserve">Phase 6 — UI Refinement &amp; Auto-Sync Hook: </w:t>
+        <w:t xml:space="preserve">Phase 6 — Production Optimization &amp; Auto-Sync Hook: </w:t>
       </w:r>
       <w:r>
         <w:rPr>
@@ -5194,7 +5336,7 @@
           <w:color w:val="000000"/>
           <w:sz w:val="22"/>
         </w:rPr>
-        <w:t>Configured git repository, auto-push post-commit hooks, created official logo.png assets, and prepared final production build.</w:t>
+        <w:t>Configured git repository, auto-push post-commit hooks, created official logo.png assets, and prepared final production deployment.</w:t>
       </w:r>
     </w:p>
     <w:p>
@@ -5211,7 +5353,7 @@
           <w:color w:val="000000"/>
           <w:sz w:val="25"/>
         </w:rPr>
-        <w:t>14.1 Deployment Pipeline</w:t>
+        <w:t>14.1 Production Deployment Pipeline (Vercel &amp; Render.com)</w:t>
       </w:r>
     </w:p>
     <w:p>
@@ -5227,7 +5369,85 @@
           <w:color w:val="000000"/>
           <w:sz w:val="22"/>
         </w:rPr>
-        <w:t>The build process utilizes Vite (`npm run build`) compiling client assets into a optimized `/dist` production bundle. The Python FastAPI backend runs via Uvicorn on port 8000. All secrets (`GROQ_API_KEY`) are managed exclusively through server-side `.env` environment variables.</w:t>
+        <w:t>EcoPilot utilizes a decoupled dual-cloud production deployment architecture to deliver high availability, low latency, and secure credential isolation:</w:t>
+      </w:r>
+    </w:p>
+    <w:p>
+      <w:pPr>
+        <w:pStyle w:val="ListBullet"/>
+        <w:spacing w:before="0" w:after="60" w:line="276" w:lineRule="auto"/>
+      </w:pPr>
+      <w:r>
+        <w:rPr>
+          <w:rFonts w:ascii="Times New Roman" w:hAnsi="Times New Roman"/>
+          <w:b/>
+          <w:i w:val="0"/>
+          <w:color w:val="000000"/>
+          <w:sz w:val="22"/>
+        </w:rPr>
+        <w:t xml:space="preserve">1. Frontend Deployment (Vercel): </w:t>
+      </w:r>
+      <w:r>
+        <w:rPr>
+          <w:rFonts w:ascii="Times New Roman" w:hAnsi="Times New Roman"/>
+          <w:b w:val="0"/>
+          <w:i w:val="0"/>
+          <w:color w:val="000000"/>
+          <w:sz w:val="22"/>
+        </w:rPr>
+        <w:t>The React 18 single-page application is compiled into an optimized static build (`dist/`) via Vite (`npm run build`) and deployed to Vercel. Vercel provides global edge CDN distribution, automatic SSL certificate provisioning, and single-page application client routing rewrite rules (`public/_redirects`).</w:t>
+      </w:r>
+    </w:p>
+    <w:p>
+      <w:pPr>
+        <w:pStyle w:val="ListBullet"/>
+        <w:spacing w:before="0" w:after="60" w:line="276" w:lineRule="auto"/>
+      </w:pPr>
+      <w:r>
+        <w:rPr>
+          <w:rFonts w:ascii="Times New Roman" w:hAnsi="Times New Roman"/>
+          <w:b/>
+          <w:i w:val="0"/>
+          <w:color w:val="000000"/>
+          <w:sz w:val="22"/>
+        </w:rPr>
+        <w:t xml:space="preserve">2. Backend Deployment (Render.com / Vercel API): </w:t>
+      </w:r>
+      <w:r>
+        <w:rPr>
+          <w:rFonts w:ascii="Times New Roman" w:hAnsi="Times New Roman"/>
+          <w:b w:val="0"/>
+          <w:i w:val="0"/>
+          <w:color w:val="000000"/>
+          <w:sz w:val="22"/>
+        </w:rPr>
+        <w:t>The Python 3.10 FastAPI backend is deployed on Render.com (and Vercel API routes), running an asynchronous Uvicorn ASGI web server (`uvicorn backend.main:app`). Render manages server-side environment secrets (`GROQ_API_KEY`, `GROQ_MODEL=qwen/qwen3.8-27b`), isolates backend logic from browser clients, and exposes production REST endpoints (`https://ecopilot-backend.onrender.com`).</w:t>
+      </w:r>
+    </w:p>
+    <w:p>
+      <w:pPr>
+        <w:pStyle w:val="ListBullet"/>
+        <w:spacing w:before="0" w:after="60" w:line="276" w:lineRule="auto"/>
+      </w:pPr>
+      <w:r>
+        <w:rPr>
+          <w:rFonts w:ascii="Times New Roman" w:hAnsi="Times New Roman"/>
+          <w:b/>
+          <w:i w:val="0"/>
+          <w:color w:val="000000"/>
+          <w:sz w:val="22"/>
+        </w:rPr>
+        <w:t xml:space="preserve">3. Automated Git Push Sync: </w:t>
+      </w:r>
+      <w:r>
+        <w:rPr>
+          <w:rFonts w:ascii="Times New Roman" w:hAnsi="Times New Roman"/>
+          <w:b w:val="0"/>
+          <w:i w:val="0"/>
+          <w:color w:val="000000"/>
+          <w:sz w:val="22"/>
+        </w:rPr>
+        <w:t>A custom Git post-commit hook (`.git/hooks/post-commit`) automatically pushes local code commits to the GitHub main branch (`https://github.com/thamizharasanm2528-byte/Eco-Pilot-`), triggering instant continuous deployment builds across Vercel and Render.com.</w:t>
       </w:r>
     </w:p>
     <w:p>

</xml_diff>